<commit_message>
updated to take rules from resume_rules.txt and modified readme
</commit_message>
<xml_diff>
--- a/output/changes_summary_StubHub.docx
+++ b/output/changes_summary_StubHub.docx
@@ -22,7 +22,7 @@
         <w:rPr>
           <w:sz w:val="20"/>
         </w:rPr>
-        <w:t>Generated: 2026-04-26 13:31</w:t>
+        <w:t>Generated: 2026-04-26 13:43</w:t>
       </w:r>
     </w:p>
     <w:p>
@@ -239,7 +239,7 @@
         <w:rPr>
           <w:sz w:val="20"/>
         </w:rPr>
-        <w:t xml:space="preserve">  blue-green deployments, code reviews, cql, git, javascript, rest apis, sonarqube</w:t>
+        <w:t xml:space="preserve">  athena, blue-green deployments, code reviews, cql, data modeling, eventbridge), git, glue, iam, integration testing, javascript, junit, jwt), mockito, sonarqube, spring security (oauth2, test-driven development</w:t>
       </w:r>
     </w:p>
     <w:p>
@@ -295,7 +295,7 @@
         <w:rPr>
           <w:sz w:val="20"/>
         </w:rPr>
-        <w:t xml:space="preserve">  alerting, custom metrics, distributed tracing, event-driven architecture, fault-tolerant design, restful apis, streaming pipelines</w:t>
+        <w:t xml:space="preserve">  alerting, distributed tracing, eventbridge, iam), spring security</w:t>
       </w:r>
     </w:p>
     <w:p>
@@ -352,7 +352,18 @@
         <w:rPr>
           <w:sz w:val="20"/>
         </w:rPr>
-        <w:t xml:space="preserve">  + - Facilitated learning by helping students complete assignments and projects in Python notebooks</w:t>
+        <w:t xml:space="preserve">  + Master of Science in Information Technology | University of Cincinnati, Cincinnati, OH | 2023</w:t>
+      </w:r>
+    </w:p>
+    <w:p>
+      <w:pPr>
+        <w:spacing w:after="20"/>
+      </w:pPr>
+      <w:r>
+        <w:rPr>
+          <w:sz w:val="20"/>
+        </w:rPr>
+        <w:t xml:space="preserve">  + Relevant Coursework: Machine Learning &amp; Data Mining, System Design, Advanced Algorithms, Principles of Cybersecurity</w:t>
       </w:r>
     </w:p>
     <w:p>
@@ -409,7 +420,7 @@
         <w:rPr>
           <w:sz w:val="20"/>
         </w:rPr>
-        <w:t xml:space="preserve">  APIs, AWS, Active, Base, Build, Built, City, Collaborate, Comprehensive, Data, Design, Designed, Engineer, For, From, Health, Java, Job, Kafka, New</w:t>
+        <w:t xml:space="preserve">  APIs, AWS, Active, Base, Build, Built, City, Collaborate, Comprehensive, Data, Design, Designed, Engineer, Environment, For, From, Health, Java, Job, Kafka</w:t>
       </w:r>
     </w:p>
     <w:p>

</xml_diff>